<commit_message>
docs: standardize checkout test technique to Equivalence Partitioning across all documents
</commit_message>
<xml_diff>
--- a/Dokumen_Lab_Session_TDS_TTM_GadgetTrustX.docx
+++ b/Dokumen_Lab_Session_TDS_TTM_GadgetTrustX.docx
@@ -9044,7 +9044,7 @@
                 <w:color w:val="1A202C"/>
                 <w:sz w:val="18"/>
               </w:rPr>
-              <w:t>State Transition Testing</w:t>
+              <w:t>Equivalence Partitioning</w:t>
             </w:r>
           </w:p>
         </w:tc>
@@ -9064,7 +9064,7 @@
                 <w:color w:val="1A202C"/>
                 <w:sz w:val="18"/>
               </w:rPr>
-              <w:t>Menguji transisi antarmuka pembayaran pembeli (Checkout Form -&gt; Midtrans Modal Open -&gt; Modal Closed/Dismissed).</w:t>
+              <w:t>Mempartisi respon checkout pembeli (pemilihan kurir pengiriman valid vs penanganan penutupan dialog bayar).</w:t>
             </w:r>
           </w:p>
         </w:tc>

</xml_diff>

<commit_message>
docs: remove order pending TCs and renumber cleanly to 24 test conditions
</commit_message>
<xml_diff>
--- a/Dokumen_Lab_Session_TDS_TTM_GadgetTrustX.docx
+++ b/Dokumen_Lab_Session_TDS_TTM_GadgetTrustX.docx
@@ -2355,7 +2355,7 @@
                 <w:color w:val="1A202C"/>
                 <w:sz w:val="18"/>
               </w:rPr>
-              <w:t>FS-04</w:t>
+              <w:t>FS-05</w:t>
             </w:r>
           </w:p>
         </w:tc>
@@ -2376,7 +2376,7 @@
                 <w:color w:val="1A202C"/>
                 <w:sz w:val="18"/>
               </w:rPr>
-              <w:t>Pemilihan alamat dan opsi kurir ekspedisi memperbarui kalkulasi tarif ongkir secara real-time</w:t>
+              <w:t>Scanner memverifikasi keaslian dan detail model untuk 15-digit IMEI valid</w:t>
             </w:r>
           </w:p>
         </w:tc>
@@ -2418,7 +2418,7 @@
                 <w:color w:val="1A202C"/>
                 <w:sz w:val="18"/>
               </w:rPr>
-              <w:t>REQ-F-07</w:t>
+              <w:t>REQ-F-08</w:t>
             </w:r>
           </w:p>
         </w:tc>
@@ -2461,7 +2461,7 @@
                 <w:color w:val="1A202C"/>
                 <w:sz w:val="18"/>
               </w:rPr>
-              <w:t>FS-04</w:t>
+              <w:t>FS-05</w:t>
             </w:r>
           </w:p>
         </w:tc>
@@ -2481,7 +2481,7 @@
                 <w:color w:val="1A202C"/>
                 <w:sz w:val="18"/>
               </w:rPr>
-              <w:t>Penutupan atau pembatalan modal pembayaran Midtrans Snap oleh pembeli tidak menghilangkan produk terpilih</w:t>
+              <w:t>Scanner menolak input IMEI dengan panjang tidak pas 15 digit (&lt;15 atau &gt;15 digit)</w:t>
             </w:r>
           </w:p>
         </w:tc>
@@ -2501,7 +2501,7 @@
                 <w:color w:val="1A202C"/>
                 <w:sz w:val="18"/>
               </w:rPr>
-              <w:t>Medium</w:t>
+              <w:t>High</w:t>
             </w:r>
           </w:p>
         </w:tc>
@@ -2521,7 +2521,7 @@
                 <w:color w:val="1A202C"/>
                 <w:sz w:val="18"/>
               </w:rPr>
-              <w:t>REQ-F-07</w:t>
+              <w:t>REQ-F-08</w:t>
             </w:r>
           </w:p>
         </w:tc>
@@ -2587,7 +2587,7 @@
                 <w:color w:val="1A202C"/>
                 <w:sz w:val="18"/>
               </w:rPr>
-              <w:t>Scanner memverifikasi keaslian dan detail model untuk 15-digit IMEI valid</w:t>
+              <w:t>Scanner menolak input IMEI yang mengandung karakter non-angka (huruf/simbol)</w:t>
             </w:r>
           </w:p>
         </w:tc>
@@ -2672,7 +2672,7 @@
                 <w:color w:val="1A202C"/>
                 <w:sz w:val="18"/>
               </w:rPr>
-              <w:t>FS-05</w:t>
+              <w:t>FS-06</w:t>
             </w:r>
           </w:p>
         </w:tc>
@@ -2692,7 +2692,7 @@
                 <w:color w:val="1A202C"/>
                 <w:sz w:val="18"/>
               </w:rPr>
-              <w:t>Scanner menolak input IMEI dengan panjang tidak pas 15 digit (&lt;15 atau &gt;15 digit)</w:t>
+              <w:t>Smart Price Checker menyajikan valuasi harga wajar pasar berbasis model Gemini AI</w:t>
             </w:r>
           </w:p>
         </w:tc>
@@ -2732,7 +2732,7 @@
                 <w:color w:val="1A202C"/>
                 <w:sz w:val="18"/>
               </w:rPr>
-              <w:t>REQ-F-08</w:t>
+              <w:t>REQ-F-09</w:t>
             </w:r>
           </w:p>
         </w:tc>
@@ -2777,7 +2777,7 @@
                 <w:color w:val="1A202C"/>
                 <w:sz w:val="18"/>
               </w:rPr>
-              <w:t>FS-05</w:t>
+              <w:t>FS-06</w:t>
             </w:r>
           </w:p>
         </w:tc>
@@ -2798,7 +2798,7 @@
                 <w:color w:val="1A202C"/>
                 <w:sz w:val="18"/>
               </w:rPr>
-              <w:t>Scanner menolak input IMEI yang mengandung karakter non-angka (huruf/simbol)</w:t>
+              <w:t>Price Checker beralih ke tabel harga cadangan lokal saat API AI mengalami timeout</w:t>
             </w:r>
           </w:p>
         </w:tc>
@@ -2819,7 +2819,7 @@
                 <w:color w:val="1A202C"/>
                 <w:sz w:val="18"/>
               </w:rPr>
-              <w:t>High</w:t>
+              <w:t>Medium</w:t>
             </w:r>
           </w:p>
         </w:tc>
@@ -2840,7 +2840,7 @@
                 <w:color w:val="1A202C"/>
                 <w:sz w:val="18"/>
               </w:rPr>
-              <w:t>REQ-F-08</w:t>
+              <w:t>REQ-F-09</w:t>
             </w:r>
           </w:p>
         </w:tc>
@@ -2883,7 +2883,7 @@
                 <w:color w:val="1A202C"/>
                 <w:sz w:val="18"/>
               </w:rPr>
-              <w:t>FS-06</w:t>
+              <w:t>FS-07</w:t>
             </w:r>
           </w:p>
         </w:tc>
@@ -2903,7 +2903,7 @@
                 <w:color w:val="1A202C"/>
                 <w:sz w:val="18"/>
               </w:rPr>
-              <w:t>Smart Price Checker menyajikan valuasi harga wajar pasar berbasis model Gemini AI</w:t>
+              <w:t>Smart Matching wizard menyajikan rekomendasi top-3 gadget sesuai preferensi budget</w:t>
             </w:r>
           </w:p>
         </w:tc>
@@ -2943,7 +2943,7 @@
                 <w:color w:val="1A202C"/>
                 <w:sz w:val="18"/>
               </w:rPr>
-              <w:t>REQ-F-09</w:t>
+              <w:t>REQ-F-10</w:t>
             </w:r>
           </w:p>
         </w:tc>
@@ -2988,7 +2988,7 @@
                 <w:color w:val="1A202C"/>
                 <w:sz w:val="18"/>
               </w:rPr>
-              <w:t>FS-06</w:t>
+              <w:t>FS-07</w:t>
             </w:r>
           </w:p>
         </w:tc>
@@ -3009,7 +3009,7 @@
                 <w:color w:val="1A202C"/>
                 <w:sz w:val="18"/>
               </w:rPr>
-              <w:t>Price Checker beralih ke tabel harga cadangan lokal saat API AI mengalami timeout</w:t>
+              <w:t>Slider budget Smart Matching dibatasi pada rentang valid (Rp 1jt s/d Rp 30jt)</w:t>
             </w:r>
           </w:p>
         </w:tc>
@@ -3051,7 +3051,7 @@
                 <w:color w:val="1A202C"/>
                 <w:sz w:val="18"/>
               </w:rPr>
-              <w:t>REQ-F-09</w:t>
+              <w:t>REQ-F-10</w:t>
             </w:r>
           </w:p>
         </w:tc>
@@ -3094,7 +3094,7 @@
                 <w:color w:val="1A202C"/>
                 <w:sz w:val="18"/>
               </w:rPr>
-              <w:t>FS-07</w:t>
+              <w:t>FS-08</w:t>
             </w:r>
           </w:p>
         </w:tc>
@@ -3114,7 +3114,7 @@
                 <w:color w:val="1A202C"/>
                 <w:sz w:val="18"/>
               </w:rPr>
-              <w:t>Smart Matching wizard menyajikan rekomendasi top-3 gadget sesuai preferensi budget</w:t>
+              <w:t>Pengguna berhasil menginput spesifikasi HP bekas, valuasi AI, dan menerbitkan listing</w:t>
             </w:r>
           </w:p>
         </w:tc>
@@ -3154,7 +3154,7 @@
                 <w:color w:val="1A202C"/>
                 <w:sz w:val="18"/>
               </w:rPr>
-              <w:t>REQ-F-10</w:t>
+              <w:t>REQ-F-11</w:t>
             </w:r>
           </w:p>
         </w:tc>
@@ -3179,217 +3179,6 @@
                 <w:sz w:val="18"/>
               </w:rPr>
               <w:t>TCond-024</w:t>
-            </w:r>
-          </w:p>
-        </w:tc>
-        <w:tc>
-          <w:tcPr>
-            <w:tcW w:type="dxa" w:w="1872"/>
-            <w:tcMar>
-              <w:top w:w="90" w:type="dxa"/>
-              <w:bottom w:w="90" w:type="dxa"/>
-              <w:left w:w="130" w:type="dxa"/>
-              <w:right w:w="130" w:type="dxa"/>
-            </w:tcMar>
-            <w:shd w:fill="F8FAFC"/>
-          </w:tcPr>
-          <w:p>
-            <w:r>
-              <w:rPr>
-                <w:color w:val="1A202C"/>
-                <w:sz w:val="18"/>
-              </w:rPr>
-              <w:t>FS-07</w:t>
-            </w:r>
-          </w:p>
-        </w:tc>
-        <w:tc>
-          <w:tcPr>
-            <w:tcW w:type="dxa" w:w="1872"/>
-            <w:tcMar>
-              <w:top w:w="90" w:type="dxa"/>
-              <w:bottom w:w="90" w:type="dxa"/>
-              <w:left w:w="130" w:type="dxa"/>
-              <w:right w:w="130" w:type="dxa"/>
-            </w:tcMar>
-            <w:shd w:fill="F8FAFC"/>
-          </w:tcPr>
-          <w:p>
-            <w:r>
-              <w:rPr>
-                <w:color w:val="1A202C"/>
-                <w:sz w:val="18"/>
-              </w:rPr>
-              <w:t>Slider budget Smart Matching dibatasi pada rentang valid (Rp 1jt s/d Rp 30jt)</w:t>
-            </w:r>
-          </w:p>
-        </w:tc>
-        <w:tc>
-          <w:tcPr>
-            <w:tcW w:type="dxa" w:w="1872"/>
-            <w:tcMar>
-              <w:top w:w="90" w:type="dxa"/>
-              <w:bottom w:w="90" w:type="dxa"/>
-              <w:left w:w="130" w:type="dxa"/>
-              <w:right w:w="130" w:type="dxa"/>
-            </w:tcMar>
-            <w:shd w:fill="F8FAFC"/>
-          </w:tcPr>
-          <w:p>
-            <w:r>
-              <w:rPr>
-                <w:color w:val="1A202C"/>
-                <w:sz w:val="18"/>
-              </w:rPr>
-              <w:t>Medium</w:t>
-            </w:r>
-          </w:p>
-        </w:tc>
-        <w:tc>
-          <w:tcPr>
-            <w:tcW w:type="dxa" w:w="1872"/>
-            <w:tcMar>
-              <w:top w:w="90" w:type="dxa"/>
-              <w:bottom w:w="90" w:type="dxa"/>
-              <w:left w:w="130" w:type="dxa"/>
-              <w:right w:w="130" w:type="dxa"/>
-            </w:tcMar>
-            <w:shd w:fill="F8FAFC"/>
-          </w:tcPr>
-          <w:p>
-            <w:r>
-              <w:rPr>
-                <w:color w:val="1A202C"/>
-                <w:sz w:val="18"/>
-              </w:rPr>
-              <w:t>REQ-F-10</w:t>
-            </w:r>
-          </w:p>
-        </w:tc>
-      </w:tr>
-      <w:tr>
-        <w:tc>
-          <w:tcPr>
-            <w:tcW w:type="dxa" w:w="1872"/>
-            <w:tcMar>
-              <w:top w:w="90" w:type="dxa"/>
-              <w:bottom w:w="90" w:type="dxa"/>
-              <w:left w:w="130" w:type="dxa"/>
-              <w:right w:w="130" w:type="dxa"/>
-            </w:tcMar>
-          </w:tcPr>
-          <w:p>
-            <w:r>
-              <w:rPr>
-                <w:b/>
-                <w:color w:val="1A202C"/>
-                <w:sz w:val="18"/>
-              </w:rPr>
-              <w:t>TCond-025</w:t>
-            </w:r>
-          </w:p>
-        </w:tc>
-        <w:tc>
-          <w:tcPr>
-            <w:tcW w:type="dxa" w:w="1872"/>
-            <w:tcMar>
-              <w:top w:w="90" w:type="dxa"/>
-              <w:bottom w:w="90" w:type="dxa"/>
-              <w:left w:w="130" w:type="dxa"/>
-              <w:right w:w="130" w:type="dxa"/>
-            </w:tcMar>
-          </w:tcPr>
-          <w:p>
-            <w:r>
-              <w:rPr>
-                <w:color w:val="1A202C"/>
-                <w:sz w:val="18"/>
-              </w:rPr>
-              <w:t>FS-08</w:t>
-            </w:r>
-          </w:p>
-        </w:tc>
-        <w:tc>
-          <w:tcPr>
-            <w:tcW w:type="dxa" w:w="1872"/>
-            <w:tcMar>
-              <w:top w:w="90" w:type="dxa"/>
-              <w:bottom w:w="90" w:type="dxa"/>
-              <w:left w:w="130" w:type="dxa"/>
-              <w:right w:w="130" w:type="dxa"/>
-            </w:tcMar>
-          </w:tcPr>
-          <w:p>
-            <w:r>
-              <w:rPr>
-                <w:color w:val="1A202C"/>
-                <w:sz w:val="18"/>
-              </w:rPr>
-              <w:t>Pengguna berhasil menginput spesifikasi HP bekas, valuasi AI, dan menerbitkan listing</w:t>
-            </w:r>
-          </w:p>
-        </w:tc>
-        <w:tc>
-          <w:tcPr>
-            <w:tcW w:type="dxa" w:w="1872"/>
-            <w:tcMar>
-              <w:top w:w="90" w:type="dxa"/>
-              <w:bottom w:w="90" w:type="dxa"/>
-              <w:left w:w="130" w:type="dxa"/>
-              <w:right w:w="130" w:type="dxa"/>
-            </w:tcMar>
-          </w:tcPr>
-          <w:p>
-            <w:r>
-              <w:rPr>
-                <w:color w:val="1A202C"/>
-                <w:sz w:val="18"/>
-              </w:rPr>
-              <w:t>High</w:t>
-            </w:r>
-          </w:p>
-        </w:tc>
-        <w:tc>
-          <w:tcPr>
-            <w:tcW w:type="dxa" w:w="1872"/>
-            <w:tcMar>
-              <w:top w:w="90" w:type="dxa"/>
-              <w:bottom w:w="90" w:type="dxa"/>
-              <w:left w:w="130" w:type="dxa"/>
-              <w:right w:w="130" w:type="dxa"/>
-            </w:tcMar>
-          </w:tcPr>
-          <w:p>
-            <w:r>
-              <w:rPr>
-                <w:color w:val="1A202C"/>
-                <w:sz w:val="18"/>
-              </w:rPr>
-              <w:t>REQ-F-11</w:t>
-            </w:r>
-          </w:p>
-        </w:tc>
-      </w:tr>
-      <w:tr>
-        <w:tc>
-          <w:tcPr>
-            <w:tcW w:type="dxa" w:w="1872"/>
-            <w:tcMar>
-              <w:top w:w="90" w:type="dxa"/>
-              <w:bottom w:w="90" w:type="dxa"/>
-              <w:left w:w="130" w:type="dxa"/>
-              <w:right w:w="130" w:type="dxa"/>
-            </w:tcMar>
-            <w:shd w:fill="F8FAFC"/>
-          </w:tcPr>
-          <w:p>
-            <w:r>
-              <w:rPr>
-                <w:b/>
-                <w:color w:val="1A202C"/>
-                <w:sz w:val="18"/>
-              </w:rPr>
-              <w:t>TCond-026</w:t>
             </w:r>
           </w:p>
         </w:tc>
@@ -5142,7 +4931,7 @@
                 <w:color w:val="1A202C"/>
                 <w:sz w:val="18"/>
               </w:rPr>
-              <w:t>Selector alamat pengiriman pembeli dan kalkulator tarif ongkir kurir</w:t>
+              <w:t>Input field 15-digit nomor IMEI TrustX Scanner</w:t>
             </w:r>
           </w:p>
         </w:tc>
@@ -5162,7 +4951,7 @@
                 <w:color w:val="1A202C"/>
                 <w:sz w:val="18"/>
               </w:rPr>
-              <w:t>TCond-016</w:t>
+              <w:t>TCond-016, TCond-017</w:t>
             </w:r>
           </w:p>
         </w:tc>
@@ -5202,7 +4991,7 @@
                 <w:color w:val="1A202C"/>
                 <w:sz w:val="18"/>
               </w:rPr>
-              <w:t>REQ-F-07</w:t>
+              <w:t>REQ-F-08</w:t>
             </w:r>
           </w:p>
         </w:tc>
@@ -5247,7 +5036,7 @@
                 <w:color w:val="1A202C"/>
                 <w:sz w:val="18"/>
               </w:rPr>
-              <w:t>Penanganan interaksi penutupan dialog pembayaran Midtrans Snap</w:t>
+              <w:t>Validasi checksum Luhn dan pencocokan database TAC</w:t>
             </w:r>
           </w:p>
         </w:tc>
@@ -5268,7 +5057,7 @@
                 <w:color w:val="1A202C"/>
                 <w:sz w:val="18"/>
               </w:rPr>
-              <w:t>TCond-017</w:t>
+              <w:t>TCond-016, TCond-018</w:t>
             </w:r>
           </w:p>
         </w:tc>
@@ -5289,7 +5078,7 @@
                 <w:color w:val="1A202C"/>
                 <w:sz w:val="18"/>
               </w:rPr>
-              <w:t>Medium</w:t>
+              <w:t>High</w:t>
             </w:r>
           </w:p>
         </w:tc>
@@ -5310,7 +5099,7 @@
                 <w:color w:val="1A202C"/>
                 <w:sz w:val="18"/>
               </w:rPr>
-              <w:t>REQ-F-07</w:t>
+              <w:t>REQ-F-08</w:t>
             </w:r>
           </w:p>
         </w:tc>
@@ -5353,7 +5142,7 @@
                 <w:color w:val="1A202C"/>
                 <w:sz w:val="18"/>
               </w:rPr>
-              <w:t>Input field 15-digit nomor IMEI TrustX Scanner</w:t>
+              <w:t>Form kalkulator spesifikasi gadget Smart Price Checker</w:t>
             </w:r>
           </w:p>
         </w:tc>
@@ -5373,7 +5162,7 @@
                 <w:color w:val="1A202C"/>
                 <w:sz w:val="18"/>
               </w:rPr>
-              <w:t>TCond-018, TCond-019</w:t>
+              <w:t>TCond-019</w:t>
             </w:r>
           </w:p>
         </w:tc>
@@ -5413,7 +5202,7 @@
                 <w:color w:val="1A202C"/>
                 <w:sz w:val="18"/>
               </w:rPr>
-              <w:t>REQ-F-08</w:t>
+              <w:t>REQ-F-09</w:t>
             </w:r>
           </w:p>
         </w:tc>
@@ -5458,7 +5247,7 @@
                 <w:color w:val="1A202C"/>
                 <w:sz w:val="18"/>
               </w:rPr>
-              <w:t>Validasi checksum Luhn dan pencocokan database TAC</w:t>
+              <w:t>Mekanisme fail-safe fallback database harga lokal</w:t>
             </w:r>
           </w:p>
         </w:tc>
@@ -5479,7 +5268,7 @@
                 <w:color w:val="1A202C"/>
                 <w:sz w:val="18"/>
               </w:rPr>
-              <w:t>TCond-018, TCond-020</w:t>
+              <w:t>TCond-020</w:t>
             </w:r>
           </w:p>
         </w:tc>
@@ -5500,7 +5289,7 @@
                 <w:color w:val="1A202C"/>
                 <w:sz w:val="18"/>
               </w:rPr>
-              <w:t>High</w:t>
+              <w:t>Medium</w:t>
             </w:r>
           </w:p>
         </w:tc>
@@ -5521,7 +5310,7 @@
                 <w:color w:val="1A202C"/>
                 <w:sz w:val="18"/>
               </w:rPr>
-              <w:t>REQ-F-08</w:t>
+              <w:t>REQ-F-09</w:t>
             </w:r>
           </w:p>
         </w:tc>
@@ -5564,7 +5353,7 @@
                 <w:color w:val="1A202C"/>
                 <w:sz w:val="18"/>
               </w:rPr>
-              <w:t>Form kalkulator spesifikasi gadget Smart Price Checker</w:t>
+              <w:t>Wizard bertahap dan slider budget Smart Matching</w:t>
             </w:r>
           </w:p>
         </w:tc>
@@ -5584,7 +5373,7 @@
                 <w:color w:val="1A202C"/>
                 <w:sz w:val="18"/>
               </w:rPr>
-              <w:t>TCond-021</w:t>
+              <w:t>TCond-021, TCond-022</w:t>
             </w:r>
           </w:p>
         </w:tc>
@@ -5624,7 +5413,7 @@
                 <w:color w:val="1A202C"/>
                 <w:sz w:val="18"/>
               </w:rPr>
-              <w:t>REQ-F-09</w:t>
+              <w:t>REQ-F-10</w:t>
             </w:r>
           </w:p>
         </w:tc>
@@ -5669,7 +5458,7 @@
                 <w:color w:val="1A202C"/>
                 <w:sz w:val="18"/>
               </w:rPr>
-              <w:t>Mekanisme fail-safe fallback database harga lokal</w:t>
+              <w:t>Form input spesifikasi dan kondisi jual HP bekas</w:t>
             </w:r>
           </w:p>
         </w:tc>
@@ -5690,7 +5479,7 @@
                 <w:color w:val="1A202C"/>
                 <w:sz w:val="18"/>
               </w:rPr>
-              <w:t>TCond-022</w:t>
+              <w:t>TCond-023</w:t>
             </w:r>
           </w:p>
         </w:tc>
@@ -5711,7 +5500,7 @@
                 <w:color w:val="1A202C"/>
                 <w:sz w:val="18"/>
               </w:rPr>
-              <w:t>Medium</w:t>
+              <w:t>High</w:t>
             </w:r>
           </w:p>
         </w:tc>
@@ -5732,7 +5521,7 @@
                 <w:color w:val="1A202C"/>
                 <w:sz w:val="18"/>
               </w:rPr>
-              <w:t>REQ-F-09</w:t>
+              <w:t>REQ-F-11</w:t>
             </w:r>
           </w:p>
         </w:tc>
@@ -5775,7 +5564,7 @@
                 <w:color w:val="1A202C"/>
                 <w:sz w:val="18"/>
               </w:rPr>
-              <w:t>Wizard bertahap dan slider budget Smart Matching</w:t>
+              <w:t>Validasi upload file gambar fisik gadget (MIME &amp; 5MB)</w:t>
             </w:r>
           </w:p>
         </w:tc>
@@ -5795,218 +5584,7 @@
                 <w:color w:val="1A202C"/>
                 <w:sz w:val="18"/>
               </w:rPr>
-              <w:t>TCond-023, TCond-024</w:t>
-            </w:r>
-          </w:p>
-        </w:tc>
-        <w:tc>
-          <w:tcPr>
-            <w:tcW w:type="dxa" w:w="1872"/>
-            <w:tcMar>
-              <w:top w:w="90" w:type="dxa"/>
-              <w:bottom w:w="90" w:type="dxa"/>
-              <w:left w:w="130" w:type="dxa"/>
-              <w:right w:w="130" w:type="dxa"/>
-            </w:tcMar>
-          </w:tcPr>
-          <w:p>
-            <w:r>
-              <w:rPr>
-                <w:color w:val="1A202C"/>
-                <w:sz w:val="18"/>
-              </w:rPr>
-              <w:t>High</w:t>
-            </w:r>
-          </w:p>
-        </w:tc>
-        <w:tc>
-          <w:tcPr>
-            <w:tcW w:type="dxa" w:w="1872"/>
-            <w:tcMar>
-              <w:top w:w="90" w:type="dxa"/>
-              <w:bottom w:w="90" w:type="dxa"/>
-              <w:left w:w="130" w:type="dxa"/>
-              <w:right w:w="130" w:type="dxa"/>
-            </w:tcMar>
-          </w:tcPr>
-          <w:p>
-            <w:r>
-              <w:rPr>
-                <w:color w:val="1A202C"/>
-                <w:sz w:val="18"/>
-              </w:rPr>
-              <w:t>REQ-F-10</w:t>
-            </w:r>
-          </w:p>
-        </w:tc>
-      </w:tr>
-      <w:tr>
-        <w:tc>
-          <w:tcPr>
-            <w:tcW w:type="dxa" w:w="1872"/>
-            <w:tcMar>
-              <w:top w:w="90" w:type="dxa"/>
-              <w:bottom w:w="90" w:type="dxa"/>
-              <w:left w:w="130" w:type="dxa"/>
-              <w:right w:w="130" w:type="dxa"/>
-            </w:tcMar>
-            <w:shd w:fill="F8FAFC"/>
-          </w:tcPr>
-          <w:p>
-            <w:r>
-              <w:rPr>
-                <w:b/>
-                <w:color w:val="1A202C"/>
-                <w:sz w:val="18"/>
-              </w:rPr>
-              <w:t>CI-022</w:t>
-            </w:r>
-          </w:p>
-        </w:tc>
-        <w:tc>
-          <w:tcPr>
-            <w:tcW w:type="dxa" w:w="1872"/>
-            <w:tcMar>
-              <w:top w:w="90" w:type="dxa"/>
-              <w:bottom w:w="90" w:type="dxa"/>
-              <w:left w:w="130" w:type="dxa"/>
-              <w:right w:w="130" w:type="dxa"/>
-            </w:tcMar>
-            <w:shd w:fill="F8FAFC"/>
-          </w:tcPr>
-          <w:p>
-            <w:r>
-              <w:rPr>
-                <w:color w:val="1A202C"/>
-                <w:sz w:val="18"/>
-              </w:rPr>
-              <w:t>Form input spesifikasi dan kondisi jual HP bekas</w:t>
-            </w:r>
-          </w:p>
-        </w:tc>
-        <w:tc>
-          <w:tcPr>
-            <w:tcW w:type="dxa" w:w="1872"/>
-            <w:tcMar>
-              <w:top w:w="90" w:type="dxa"/>
-              <w:bottom w:w="90" w:type="dxa"/>
-              <w:left w:w="130" w:type="dxa"/>
-              <w:right w:w="130" w:type="dxa"/>
-            </w:tcMar>
-            <w:shd w:fill="F8FAFC"/>
-          </w:tcPr>
-          <w:p>
-            <w:r>
-              <w:rPr>
-                <w:color w:val="1A202C"/>
-                <w:sz w:val="18"/>
-              </w:rPr>
-              <w:t>TCond-025</w:t>
-            </w:r>
-          </w:p>
-        </w:tc>
-        <w:tc>
-          <w:tcPr>
-            <w:tcW w:type="dxa" w:w="1872"/>
-            <w:tcMar>
-              <w:top w:w="90" w:type="dxa"/>
-              <w:bottom w:w="90" w:type="dxa"/>
-              <w:left w:w="130" w:type="dxa"/>
-              <w:right w:w="130" w:type="dxa"/>
-            </w:tcMar>
-            <w:shd w:fill="F8FAFC"/>
-          </w:tcPr>
-          <w:p>
-            <w:r>
-              <w:rPr>
-                <w:color w:val="1A202C"/>
-                <w:sz w:val="18"/>
-              </w:rPr>
-              <w:t>High</w:t>
-            </w:r>
-          </w:p>
-        </w:tc>
-        <w:tc>
-          <w:tcPr>
-            <w:tcW w:type="dxa" w:w="1872"/>
-            <w:tcMar>
-              <w:top w:w="90" w:type="dxa"/>
-              <w:bottom w:w="90" w:type="dxa"/>
-              <w:left w:w="130" w:type="dxa"/>
-              <w:right w:w="130" w:type="dxa"/>
-            </w:tcMar>
-            <w:shd w:fill="F8FAFC"/>
-          </w:tcPr>
-          <w:p>
-            <w:r>
-              <w:rPr>
-                <w:color w:val="1A202C"/>
-                <w:sz w:val="18"/>
-              </w:rPr>
-              <w:t>REQ-F-11</w:t>
-            </w:r>
-          </w:p>
-        </w:tc>
-      </w:tr>
-      <w:tr>
-        <w:tc>
-          <w:tcPr>
-            <w:tcW w:type="dxa" w:w="1872"/>
-            <w:tcMar>
-              <w:top w:w="90" w:type="dxa"/>
-              <w:bottom w:w="90" w:type="dxa"/>
-              <w:left w:w="130" w:type="dxa"/>
-              <w:right w:w="130" w:type="dxa"/>
-            </w:tcMar>
-          </w:tcPr>
-          <w:p>
-            <w:r>
-              <w:rPr>
-                <w:b/>
-                <w:color w:val="1A202C"/>
-                <w:sz w:val="18"/>
-              </w:rPr>
-              <w:t>CI-023</w:t>
-            </w:r>
-          </w:p>
-        </w:tc>
-        <w:tc>
-          <w:tcPr>
-            <w:tcW w:type="dxa" w:w="1872"/>
-            <w:tcMar>
-              <w:top w:w="90" w:type="dxa"/>
-              <w:bottom w:w="90" w:type="dxa"/>
-              <w:left w:w="130" w:type="dxa"/>
-              <w:right w:w="130" w:type="dxa"/>
-            </w:tcMar>
-          </w:tcPr>
-          <w:p>
-            <w:r>
-              <w:rPr>
-                <w:color w:val="1A202C"/>
-                <w:sz w:val="18"/>
-              </w:rPr>
-              <w:t>Validasi upload file gambar fisik gadget (MIME &amp; 5MB)</w:t>
-            </w:r>
-          </w:p>
-        </w:tc>
-        <w:tc>
-          <w:tcPr>
-            <w:tcW w:type="dxa" w:w="1872"/>
-            <w:tcMar>
-              <w:top w:w="90" w:type="dxa"/>
-              <w:bottom w:w="90" w:type="dxa"/>
-              <w:left w:w="130" w:type="dxa"/>
-              <w:right w:w="130" w:type="dxa"/>
-            </w:tcMar>
-          </w:tcPr>
-          <w:p>
-            <w:r>
-              <w:rPr>
-                <w:color w:val="1A202C"/>
-                <w:sz w:val="18"/>
-              </w:rPr>
-              <w:t>TCond-026</w:t>
+              <w:t>TCond-024</w:t>
             </w:r>
           </w:p>
         </w:tc>
@@ -7469,7 +7047,7 @@
                 <w:color w:val="1A202C"/>
                 <w:sz w:val="18"/>
               </w:rPr>
-              <w:t>REQ-F-07</w:t>
+              <w:t>REQ-F-08</w:t>
             </w:r>
           </w:p>
         </w:tc>
@@ -7490,7 +7068,7 @@
                 <w:color w:val="1A202C"/>
                 <w:sz w:val="18"/>
               </w:rPr>
-              <w:t>FS-04</w:t>
+              <w:t>FS-05</w:t>
             </w:r>
           </w:p>
         </w:tc>
@@ -7532,7 +7110,7 @@
                 <w:color w:val="1A202C"/>
                 <w:sz w:val="18"/>
               </w:rPr>
-              <w:t>CI-015</w:t>
+              <w:t>CI-015, CI-016</w:t>
             </w:r>
           </w:p>
         </w:tc>
@@ -7555,7 +7133,7 @@
                 <w:color w:val="1A202C"/>
                 <w:sz w:val="18"/>
               </w:rPr>
-              <w:t>REQ-F-07</w:t>
+              <w:t>REQ-F-08</w:t>
             </w:r>
           </w:p>
         </w:tc>
@@ -7575,7 +7153,7 @@
                 <w:color w:val="1A202C"/>
                 <w:sz w:val="18"/>
               </w:rPr>
-              <w:t>FS-04</w:t>
+              <w:t>FS-05</w:t>
             </w:r>
           </w:p>
         </w:tc>
@@ -7615,7 +7193,7 @@
                 <w:color w:val="1A202C"/>
                 <w:sz w:val="18"/>
               </w:rPr>
-              <w:t>CI-016</w:t>
+              <w:t>CI-015</w:t>
             </w:r>
           </w:p>
         </w:tc>
@@ -7702,7 +7280,7 @@
                 <w:color w:val="1A202C"/>
                 <w:sz w:val="18"/>
               </w:rPr>
-              <w:t>CI-017, CI-018</w:t>
+              <w:t>CI-015, CI-016</w:t>
             </w:r>
           </w:p>
         </w:tc>
@@ -7725,7 +7303,7 @@
                 <w:color w:val="1A202C"/>
                 <w:sz w:val="18"/>
               </w:rPr>
-              <w:t>REQ-F-08</w:t>
+              <w:t>REQ-F-09</w:t>
             </w:r>
           </w:p>
         </w:tc>
@@ -7745,7 +7323,7 @@
                 <w:color w:val="1A202C"/>
                 <w:sz w:val="18"/>
               </w:rPr>
-              <w:t>FS-05</w:t>
+              <w:t>FS-06</w:t>
             </w:r>
           </w:p>
         </w:tc>
@@ -7809,7 +7387,7 @@
                 <w:color w:val="1A202C"/>
                 <w:sz w:val="18"/>
               </w:rPr>
-              <w:t>REQ-F-08</w:t>
+              <w:t>REQ-F-09</w:t>
             </w:r>
           </w:p>
         </w:tc>
@@ -7830,7 +7408,7 @@
                 <w:color w:val="1A202C"/>
                 <w:sz w:val="18"/>
               </w:rPr>
-              <w:t>FS-05</w:t>
+              <w:t>FS-06</w:t>
             </w:r>
           </w:p>
         </w:tc>
@@ -7872,7 +7450,7 @@
                 <w:color w:val="1A202C"/>
                 <w:sz w:val="18"/>
               </w:rPr>
-              <w:t>CI-017, CI-018</w:t>
+              <w:t>CI-018</w:t>
             </w:r>
           </w:p>
         </w:tc>
@@ -7895,7 +7473,7 @@
                 <w:color w:val="1A202C"/>
                 <w:sz w:val="18"/>
               </w:rPr>
-              <w:t>REQ-F-09</w:t>
+              <w:t>REQ-F-10</w:t>
             </w:r>
           </w:p>
         </w:tc>
@@ -7915,7 +7493,7 @@
                 <w:color w:val="1A202C"/>
                 <w:sz w:val="18"/>
               </w:rPr>
-              <w:t>FS-06</w:t>
+              <w:t>FS-07</w:t>
             </w:r>
           </w:p>
         </w:tc>
@@ -7979,7 +7557,7 @@
                 <w:color w:val="1A202C"/>
                 <w:sz w:val="18"/>
               </w:rPr>
-              <w:t>REQ-F-09</w:t>
+              <w:t>REQ-F-10</w:t>
             </w:r>
           </w:p>
         </w:tc>
@@ -8000,7 +7578,7 @@
                 <w:color w:val="1A202C"/>
                 <w:sz w:val="18"/>
               </w:rPr>
-              <w:t>FS-06</w:t>
+              <w:t>FS-07</w:t>
             </w:r>
           </w:p>
         </w:tc>
@@ -8042,7 +7620,7 @@
                 <w:color w:val="1A202C"/>
                 <w:sz w:val="18"/>
               </w:rPr>
-              <w:t>CI-020</w:t>
+              <w:t>CI-019</w:t>
             </w:r>
           </w:p>
         </w:tc>
@@ -8065,7 +7643,7 @@
                 <w:color w:val="1A202C"/>
                 <w:sz w:val="18"/>
               </w:rPr>
-              <w:t>REQ-F-10</w:t>
+              <w:t>REQ-F-11</w:t>
             </w:r>
           </w:p>
         </w:tc>
@@ -8085,7 +7663,7 @@
                 <w:color w:val="1A202C"/>
                 <w:sz w:val="18"/>
               </w:rPr>
-              <w:t>FS-07</w:t>
+              <w:t>FS-08</w:t>
             </w:r>
           </w:p>
         </w:tc>
@@ -8125,7 +7703,7 @@
                 <w:color w:val="1A202C"/>
                 <w:sz w:val="18"/>
               </w:rPr>
-              <w:t>CI-021</w:t>
+              <w:t>CI-020</w:t>
             </w:r>
           </w:p>
         </w:tc>
@@ -8149,7 +7727,7 @@
                 <w:color w:val="1A202C"/>
                 <w:sz w:val="18"/>
               </w:rPr>
-              <w:t>REQ-F-10</w:t>
+              <w:t>REQ-F-11</w:t>
             </w:r>
           </w:p>
         </w:tc>
@@ -8170,7 +7748,7 @@
                 <w:color w:val="1A202C"/>
                 <w:sz w:val="18"/>
               </w:rPr>
-              <w:t>FS-07</w:t>
+              <w:t>FS-08</w:t>
             </w:r>
           </w:p>
         </w:tc>
@@ -8213,176 +7791,6 @@
                 <w:sz w:val="18"/>
               </w:rPr>
               <w:t>CI-021</w:t>
-            </w:r>
-          </w:p>
-        </w:tc>
-      </w:tr>
-      <w:tr>
-        <w:tc>
-          <w:tcPr>
-            <w:tcW w:type="dxa" w:w="2340"/>
-            <w:tcMar>
-              <w:top w:w="90" w:type="dxa"/>
-              <w:bottom w:w="90" w:type="dxa"/>
-              <w:left w:w="130" w:type="dxa"/>
-              <w:right w:w="130" w:type="dxa"/>
-            </w:tcMar>
-          </w:tcPr>
-          <w:p>
-            <w:r>
-              <w:rPr>
-                <w:b/>
-                <w:color w:val="1A202C"/>
-                <w:sz w:val="18"/>
-              </w:rPr>
-              <w:t>REQ-F-11</w:t>
-            </w:r>
-          </w:p>
-        </w:tc>
-        <w:tc>
-          <w:tcPr>
-            <w:tcW w:type="dxa" w:w="2340"/>
-            <w:tcMar>
-              <w:top w:w="90" w:type="dxa"/>
-              <w:bottom w:w="90" w:type="dxa"/>
-              <w:left w:w="130" w:type="dxa"/>
-              <w:right w:w="130" w:type="dxa"/>
-            </w:tcMar>
-          </w:tcPr>
-          <w:p>
-            <w:r>
-              <w:rPr>
-                <w:color w:val="1A202C"/>
-                <w:sz w:val="18"/>
-              </w:rPr>
-              <w:t>FS-08</w:t>
-            </w:r>
-          </w:p>
-        </w:tc>
-        <w:tc>
-          <w:tcPr>
-            <w:tcW w:type="dxa" w:w="2340"/>
-            <w:tcMar>
-              <w:top w:w="90" w:type="dxa"/>
-              <w:bottom w:w="90" w:type="dxa"/>
-              <w:left w:w="130" w:type="dxa"/>
-              <w:right w:w="130" w:type="dxa"/>
-            </w:tcMar>
-          </w:tcPr>
-          <w:p>
-            <w:r>
-              <w:rPr>
-                <w:color w:val="1A202C"/>
-                <w:sz w:val="18"/>
-              </w:rPr>
-              <w:t>TCond-025</w:t>
-            </w:r>
-          </w:p>
-        </w:tc>
-        <w:tc>
-          <w:tcPr>
-            <w:tcW w:type="dxa" w:w="2340"/>
-            <w:tcMar>
-              <w:top w:w="90" w:type="dxa"/>
-              <w:bottom w:w="90" w:type="dxa"/>
-              <w:left w:w="130" w:type="dxa"/>
-              <w:right w:w="130" w:type="dxa"/>
-            </w:tcMar>
-          </w:tcPr>
-          <w:p>
-            <w:r>
-              <w:rPr>
-                <w:color w:val="1A202C"/>
-                <w:sz w:val="18"/>
-              </w:rPr>
-              <w:t>CI-022</w:t>
-            </w:r>
-          </w:p>
-        </w:tc>
-      </w:tr>
-      <w:tr>
-        <w:tc>
-          <w:tcPr>
-            <w:tcW w:type="dxa" w:w="2340"/>
-            <w:tcMar>
-              <w:top w:w="90" w:type="dxa"/>
-              <w:bottom w:w="90" w:type="dxa"/>
-              <w:left w:w="130" w:type="dxa"/>
-              <w:right w:w="130" w:type="dxa"/>
-            </w:tcMar>
-            <w:shd w:fill="F8FAFC"/>
-          </w:tcPr>
-          <w:p>
-            <w:r>
-              <w:rPr>
-                <w:b/>
-                <w:color w:val="1A202C"/>
-                <w:sz w:val="18"/>
-              </w:rPr>
-              <w:t>REQ-F-11</w:t>
-            </w:r>
-          </w:p>
-        </w:tc>
-        <w:tc>
-          <w:tcPr>
-            <w:tcW w:type="dxa" w:w="2340"/>
-            <w:tcMar>
-              <w:top w:w="90" w:type="dxa"/>
-              <w:bottom w:w="90" w:type="dxa"/>
-              <w:left w:w="130" w:type="dxa"/>
-              <w:right w:w="130" w:type="dxa"/>
-            </w:tcMar>
-            <w:shd w:fill="F8FAFC"/>
-          </w:tcPr>
-          <w:p>
-            <w:r>
-              <w:rPr>
-                <w:color w:val="1A202C"/>
-                <w:sz w:val="18"/>
-              </w:rPr>
-              <w:t>FS-08</w:t>
-            </w:r>
-          </w:p>
-        </w:tc>
-        <w:tc>
-          <w:tcPr>
-            <w:tcW w:type="dxa" w:w="2340"/>
-            <w:tcMar>
-              <w:top w:w="90" w:type="dxa"/>
-              <w:bottom w:w="90" w:type="dxa"/>
-              <w:left w:w="130" w:type="dxa"/>
-              <w:right w:w="130" w:type="dxa"/>
-            </w:tcMar>
-            <w:shd w:fill="F8FAFC"/>
-          </w:tcPr>
-          <w:p>
-            <w:r>
-              <w:rPr>
-                <w:color w:val="1A202C"/>
-                <w:sz w:val="18"/>
-              </w:rPr>
-              <w:t>TCond-026</w:t>
-            </w:r>
-          </w:p>
-        </w:tc>
-        <w:tc>
-          <w:tcPr>
-            <w:tcW w:type="dxa" w:w="2340"/>
-            <w:tcMar>
-              <w:top w:w="90" w:type="dxa"/>
-              <w:bottom w:w="90" w:type="dxa"/>
-              <w:left w:w="130" w:type="dxa"/>
-              <w:right w:w="130" w:type="dxa"/>
-            </w:tcMar>
-            <w:shd w:fill="F8FAFC"/>
-          </w:tcPr>
-          <w:p>
-            <w:r>
-              <w:rPr>
-                <w:color w:val="1A202C"/>
-                <w:sz w:val="18"/>
-              </w:rPr>
-              <w:t>CI-023</w:t>
             </w:r>
           </w:p>
         </w:tc>
@@ -9024,7 +8432,7 @@
                 <w:color w:val="1A202C"/>
                 <w:sz w:val="18"/>
               </w:rPr>
-              <w:t>TCond-016, 017</w:t>
+              <w:t>TCond-016, 017, 018</w:t>
             </w:r>
           </w:p>
         </w:tc>
@@ -9044,7 +8452,7 @@
                 <w:color w:val="1A202C"/>
                 <w:sz w:val="18"/>
               </w:rPr>
-              <w:t>Equivalence Partitioning</w:t>
+              <w:t>Boundary Value Analysis &amp; Luhn</w:t>
             </w:r>
           </w:p>
         </w:tc>
@@ -9064,7 +8472,7 @@
                 <w:color w:val="1A202C"/>
                 <w:sz w:val="18"/>
               </w:rPr>
-              <w:t>Mempartisi respon checkout pembeli (pemilihan kurir pengiriman valid vs penanganan penutupan dialog bayar).</w:t>
+              <w:t>Menguji batas digit nomor IMEI (14, 15, 16 digit) dan validitas algoritma checksum modulo 10.</w:t>
             </w:r>
           </w:p>
         </w:tc>
@@ -9088,7 +8496,7 @@
                 <w:color w:val="1A202C"/>
                 <w:sz w:val="18"/>
               </w:rPr>
-              <w:t>TCond-018, 019, 020</w:t>
+              <w:t>TCond-019, 020</w:t>
             </w:r>
           </w:p>
         </w:tc>
@@ -9109,7 +8517,7 @@
                 <w:color w:val="1A202C"/>
                 <w:sz w:val="18"/>
               </w:rPr>
-              <w:t>Boundary Value Analysis &amp; Luhn</w:t>
+              <w:t>Equivalence Partitioning &amp; Fallback</w:t>
             </w:r>
           </w:p>
         </w:tc>
@@ -9130,7 +8538,7 @@
                 <w:color w:val="1A202C"/>
                 <w:sz w:val="18"/>
               </w:rPr>
-              <w:t>Menguji batas digit nomor IMEI (14, 15, 16 digit) dan validitas algoritma checksum modulo 10.</w:t>
+              <w:t>Menguji keakuratan estimasi harga model Gemini AI dan mekanisme fail-safe fallback lokal.</w:t>
             </w:r>
           </w:p>
         </w:tc>
@@ -9173,7 +8581,7 @@
                 <w:color w:val="1A202C"/>
                 <w:sz w:val="18"/>
               </w:rPr>
-              <w:t>Equivalence Partitioning &amp; Fallback</w:t>
+              <w:t>Boundary Value Analysis</w:t>
             </w:r>
           </w:p>
         </w:tc>
@@ -9193,7 +8601,7 @@
                 <w:color w:val="1A202C"/>
                 <w:sz w:val="18"/>
               </w:rPr>
-              <w:t>Menguji keakuratan estimasi harga model Gemini AI dan mekanisme fail-safe fallback lokal.</w:t>
+              <w:t>Menguji nilai batas minimum (Rp 1.000.000) dan maksimum (Rp 30.000.000) pada slider budget.</w:t>
             </w:r>
           </w:p>
         </w:tc>
@@ -9238,7 +8646,7 @@
                 <w:color w:val="1A202C"/>
                 <w:sz w:val="18"/>
               </w:rPr>
-              <w:t>Boundary Value Analysis</w:t>
+              <w:t>Equivalence Partitioning &amp; BVA</w:t>
             </w:r>
           </w:p>
         </w:tc>
@@ -9252,69 +8660,6 @@
               <w:right w:w="130" w:type="dxa"/>
             </w:tcMar>
             <w:shd w:fill="F8FAFC"/>
-          </w:tcPr>
-          <w:p>
-            <w:r>
-              <w:rPr>
-                <w:color w:val="1A202C"/>
-                <w:sz w:val="18"/>
-              </w:rPr>
-              <w:t>Menguji nilai batas minimum (Rp 1.000.000) dan maksimum (Rp 30.000.000) pada slider budget.</w:t>
-            </w:r>
-          </w:p>
-        </w:tc>
-      </w:tr>
-      <w:tr>
-        <w:tc>
-          <w:tcPr>
-            <w:tcW w:type="dxa" w:w="3120"/>
-            <w:tcMar>
-              <w:top w:w="90" w:type="dxa"/>
-              <w:bottom w:w="90" w:type="dxa"/>
-              <w:left w:w="130" w:type="dxa"/>
-              <w:right w:w="130" w:type="dxa"/>
-            </w:tcMar>
-          </w:tcPr>
-          <w:p>
-            <w:r>
-              <w:rPr>
-                <w:b/>
-                <w:color w:val="1A202C"/>
-                <w:sz w:val="18"/>
-              </w:rPr>
-              <w:t>TCond-025, 026</w:t>
-            </w:r>
-          </w:p>
-        </w:tc>
-        <w:tc>
-          <w:tcPr>
-            <w:tcW w:type="dxa" w:w="3120"/>
-            <w:tcMar>
-              <w:top w:w="90" w:type="dxa"/>
-              <w:bottom w:w="90" w:type="dxa"/>
-              <w:left w:w="130" w:type="dxa"/>
-              <w:right w:w="130" w:type="dxa"/>
-            </w:tcMar>
-          </w:tcPr>
-          <w:p>
-            <w:r>
-              <w:rPr>
-                <w:color w:val="1A202C"/>
-                <w:sz w:val="18"/>
-              </w:rPr>
-              <w:t>Equivalence Partitioning &amp; BVA</w:t>
-            </w:r>
-          </w:p>
-        </w:tc>
-        <w:tc>
-          <w:tcPr>
-            <w:tcW w:type="dxa" w:w="3120"/>
-            <w:tcMar>
-              <w:top w:w="90" w:type="dxa"/>
-              <w:bottom w:w="90" w:type="dxa"/>
-              <w:left w:w="130" w:type="dxa"/>
-              <w:right w:w="130" w:type="dxa"/>
-            </w:tcMar>
           </w:tcPr>
           <w:p>
             <w:r>

</xml_diff>